<commit_message>
Updated all customers section
</commit_message>
<xml_diff>
--- a/ProWater-CRM-Changelog.docx
+++ b/ProWater-CRM-Changelog.docx
@@ -48,20 +48,6 @@
     <w:p>
       <w:pPr>
         <w:pStyle w:val="Heading2"/>
-      </w:pPr>
-      <w:r>
-        <w:t>v2.29.331   —   2026-09-03</w:t>
-      </w:r>
-    </w:p>
-    <w:p>
-      <w:pPr/>
-      <w:r>
-        <w:t>Password Vault (`src/modules/Vault.jsx`, `src/shared/core.js`): Major UI and feature overhaul per explicit user request ('make the UI better especially for the popups and the features'). (1) Added an integrated 16-character strong password generator (`generateStrongPassword`) with instant 1-click population in the Add/Edit modal. (2) Added a real-time 4-bar password strength evaluation meter (`checkPasswordStrength`) with strength label, color coding, and character counter. (3) Added password show/hide eye toggle inside the modal input. (4) Added category classification ('DevOps &amp; Cloud', 'Payment &amp; Billing', 'Internal Tools', 'Email &amp; Comm', 'Vendors &amp; Social', 'General') with interactive filter pills and live count badges in the toolbar, mapped in `mapVaultDoc`. (5) Added custom color-gradient service initials avatars for every credential in the table. (6) Replaced browser `confirm()` with a modern in-app Delete Confirmation Modal. (7) Upgraded the Vault PIN Gate with interactive 4-box PIN digit visualizations, glowing focus rings, and cooldown timers. Verified via a clean `npm run build`.</w:t>
-      </w:r>
-    </w:p>
-    <w:p>
-      <w:pPr>
-        <w:pStyle w:val="Heading2"/>
         <w:spacing w:after="80" w:before="300"/>
       </w:pPr>
       <w:r>
@@ -1332,6 +1318,131 @@
           <w:szCs w:val="21"/>
         </w:rPr>
         <w:t xml:space="preserve">Password Vault (`src/modules/Vault.jsx`): per explicit user request ('Untill the 4 digits is not entered, dont show the Unlock button'), the 'Enter Vault PIN' screen's Unlock button is now only rendered once all 4 digits are typed (`{pin.length === 4 &amp;&amp; &lt;button&gt;...}`), rather than always shown but merely enabled — the 'Forgot PIN?' link stays visible throughout. Verified live: typing 1-3 digits shows only the dot placeholders and Forgot PIN link with no Unlock button at all; the 4th digit makes it appear immediately.</w:t>
+      </w:r>
+    </w:p>
+    <w:p>
+      <w:pPr>
+        <w:pStyle w:val="Heading2"/>
+        <w:spacing w:after="80" w:before="300"/>
+      </w:pPr>
+      <w:r>
+        <w:rPr>
+          <w:b/>
+          <w:bCs/>
+        </w:rPr>
+        <w:t xml:space="preserve">v2.29.331</w:t>
+      </w:r>
+    </w:p>
+    <w:p>
+      <w:pPr>
+        <w:spacing w:after="120"/>
+      </w:pPr>
+      <w:r>
+        <w:rPr>
+          <w:sz w:val="21"/>
+          <w:szCs w:val="21"/>
+        </w:rPr>
+        <w:t xml:space="preserve">Password Vault (`src/modules/Vault.jsx`, `src/shared/core.js`): Major UI and feature overhaul per explicit user request ('make the UI better especially for the popups and the features'). (1) Added an integrated 16-character strong password generator (`generateStrongPassword`) with instant 1-click population in the Add/Edit modal. (2) Added a real-time 4-bar password strength evaluation meter (`checkPasswordStrength`) with strength label, color coding, and character counter. (3) Added password show/hide eye toggle inside the modal input. (4) Added category classification ('DevOps &amp; Cloud', 'Payment &amp; Billing', 'Internal Tools', 'Email &amp; Comm', 'Vendors &amp; Social', 'General') with interactive filter pills and live count badges in the toolbar, mapped in `mapVaultDoc`. (5) Added custom color-gradient service initials avatars for every credential in the table. (6) Replaced browser `confirm()` with a modern in-app Delete Confirmation Modal. (7) Upgraded the Vault PIN Gate with interactive 4-box PIN digit visualizations, glowing focus rings, and cooldown timers. Verified via a clean `npm run build`.</w:t>
+      </w:r>
+    </w:p>
+    <w:p>
+      <w:pPr>
+        <w:pStyle w:val="Heading2"/>
+        <w:spacing w:after="80" w:before="300"/>
+      </w:pPr>
+      <w:r>
+        <w:rPr>
+          <w:b/>
+          <w:bCs/>
+        </w:rPr>
+        <w:t xml:space="preserve">v2.29.332</w:t>
+      </w:r>
+    </w:p>
+    <w:p>
+      <w:pPr>
+        <w:spacing w:after="120"/>
+      </w:pPr>
+      <w:r>
+        <w:rPr>
+          <w:sz w:val="21"/>
+          <w:szCs w:val="21"/>
+        </w:rPr>
+        <w:t xml:space="preserve">Shared UI &gt; Login (`src/shared/ui.jsx`): Added version badge pill ('Wisdom 2.0 • v{APP_VERSION}') and copyright notice ('© 2026 ProWater Internal Systems') to the login card footer per explicit user request. Styled in high-contrast emerald tint and subtle muted typography aligned with the frosted-glass aesthetic. Verified via a clean `npm run build`.</w:t>
+      </w:r>
+    </w:p>
+    <w:p>
+      <w:pPr>
+        <w:pStyle w:val="Heading2"/>
+        <w:spacing w:after="80" w:before="300"/>
+      </w:pPr>
+      <w:r>
+        <w:rPr>
+          <w:b/>
+          <w:bCs/>
+        </w:rPr>
+        <w:t xml:space="preserve">v2.29.333</w:t>
+      </w:r>
+    </w:p>
+    <w:p>
+      <w:pPr>
+        <w:spacing w:after="120"/>
+      </w:pPr>
+      <w:r>
+        <w:rPr>
+          <w:sz w:val="21"/>
+          <w:szCs w:val="21"/>
+        </w:rPr>
+        <w:t xml:space="preserve">Shared UI &gt; Login (`src/shared/ui.jsx`): Removed the runner character and doorway sign-in animation per explicit user request ('remove that animation on the sign in, just show as SUCCESS in Green button'). The submit button now immediately transitions to an emerald green '#08805A' state displaying '&lt;Check size={20} /&gt; SUCCESS' upon successful authentication, eliminating lag and delivering a clean, modern sign-in experience. Verified via a clean `npm run build`.</w:t>
+      </w:r>
+    </w:p>
+    <w:p>
+      <w:pPr>
+        <w:pStyle w:val="Heading2"/>
+        <w:spacing w:after="80" w:before="300"/>
+      </w:pPr>
+      <w:r>
+        <w:rPr>
+          <w:b/>
+          <w:bCs/>
+        </w:rPr>
+        <w:t xml:space="preserve">v2.29.334</w:t>
+      </w:r>
+    </w:p>
+    <w:p>
+      <w:pPr>
+        <w:spacing w:after="120"/>
+      </w:pPr>
+      <w:r>
+        <w:rPr>
+          <w:sz w:val="21"/>
+          <w:szCs w:val="21"/>
+        </w:rPr>
+        <w:t xml:space="preserve">Shared UI &gt; Login (`src/shared/ui.jsx`): Redesigned the login modal into a balanced horizontal two-column layout per explicit user request ('That login popup looks to big, Instead of vertical can you divide the popup in horizontal way'). Left pane houses brand identity, logo, Wisdom 2.0 system badge, and version/copyright footer; right pane houses clean, compact sign-in form fields with responsive mobile fallback. Verified via a clean `npm run build`.</w:t>
+      </w:r>
+    </w:p>
+    <w:p>
+      <w:pPr>
+        <w:pStyle w:val="Heading2"/>
+        <w:spacing w:after="80" w:before="300"/>
+      </w:pPr>
+      <w:r>
+        <w:rPr>
+          <w:b/>
+          <w:bCs/>
+        </w:rPr>
+        <w:t xml:space="preserve">v2.29.335</w:t>
+      </w:r>
+    </w:p>
+    <w:p>
+      <w:pPr>
+        <w:spacing w:after="120"/>
+      </w:pPr>
+      <w:r>
+        <w:rPr>
+          <w:sz w:val="21"/>
+          <w:szCs w:val="21"/>
+        </w:rPr>
+        <w:t xml:space="preserve">Customer &gt; All Customers (`src/modules/Customer.jsx`): Uninstalled/Inactive customers no longer load into the table by default, per explicit user request ('Dont load the Uninstalled and In-Active customers by default in the table / When i click on the KPI card for Inactive customers that time you show it'), refined by an immediate follow-up ('when i click on inactive customers it should show only inactive customers') to an ISOLATE toggle rather than a reveal-alongside one. Added `isHiddenByDefault(c)` — the same Un-Installed(deviceStatus)/Inactive(status) signal `rowTint` already uses to color those rows red/orange — wired into `filtered`/`facetPop` as `showInactive ? isHiddenByDefault(c) : !isHiddenByDefault(c)`: the default (unclicked) view shows everything EXCEPT Uninstalled/Inactive; clicking the existing 'Active Customers' KPI card's '{N} Inactive customers' stat flips the table to show ONLY the Uninstalled/Inactive customers (not both populations combined) — clicking again returns to the default view. Text updates to '{N} Inactive customers (showing only)' with an underline while isolated. Since `results` (and every KPI derived from it — Own/Normal/Hot&amp;Cold device-type counts, DP/Zoho split, filter-type breakdown) now pivots to whichever population is currently selected, the Inactive-customers COUNT itself is deliberately computed from a separate, ungated population (`inactivePop`, still respecting the other society/stack/device-type/filter-type/search filters) so the stat stays accurate and clickable even while the default view has zero of them visible. `showInactive` folds into `hasActiveFilters`/`handleResetFilters`, so 'Reset Filters' appears once toggled and resetting returns to the true default view. Verified the isolate logic with a standalone Node script against synthetic active/inactive/uninstalled/paused customers (default view: only active+paused; isolated view: ONLY the 2 inactive/uninstalled, none of the others) since the sample-data fallback has no non-active customers to visually confirm against; verified live via a clean `npm run build` and a real click on the stat — every KPI on the page correctly dropped to 0 and the table showed '0 results' / 'No customers with a Purifier ID' (accurate, since the sample data has zero customers matching Uninstalled/Inactive), with 'Reset Filters' appearing and no console errors.</w:t>
       </w:r>
     </w:p>
     <w:sectPr>

</xml_diff>

<commit_message>
Updated password vault bugs
</commit_message>
<xml_diff>
--- a/ProWater-CRM-Changelog.docx
+++ b/ProWater-CRM-Changelog.docx
@@ -48,6 +48,20 @@
     <w:p>
       <w:pPr>
         <w:pStyle w:val="Heading2"/>
+      </w:pPr>
+      <w:r>
+        <w:t>v2.29.338   —   2026-09-03</w:t>
+      </w:r>
+    </w:p>
+    <w:p>
+      <w:pPr/>
+      <w:r>
+        <w:t>Password Vault (`src/modules/Vault.jsx`): Multi-layered browser autofill defense overhaul per live user issue ('when i am click on add new credential all the data goes off and filters my email ID anis@drinkprime.in... also by default password is entered'). (1) Converted the toolbar search input to `type="search"` with `data-form-type="other"`, `data-lpignore="true"`, and `data-1p-ignore="true"` to prevent Chrome/Safari from pairing it as an account username. (2) Added hidden decoy input traps inside the Add/Edit modal. (3) Set `autoComplete="new-password"` and strict ignore tags on the modal password input to ensure new credentials always open completely blank. Verified via clean `npm run build`.</w:t>
+      </w:r>
+    </w:p>
+    <w:p>
+      <w:pPr>
+        <w:pStyle w:val="Heading2"/>
         <w:spacing w:after="80" w:before="300"/>
       </w:pPr>
       <w:r>
@@ -1468,6 +1482,31 @@
           <w:szCs w:val="21"/>
         </w:rPr>
         <w:t xml:space="preserve">Password Vault (`src/modules/Vault.jsx`): added a **Created By** column to the credentials table, per explicit user request ('add created by also here'), reading `e.createdBy` (already captured by `vaultApi.add`/`update` in core.js). Placed right after Created, so each timestamp sits next to its own 'by' column — Created, Created By, Updated, Updated By. Table `minWidth` bumped 1050→1180 and the empty-state row's `colSpan` corrected 10→11 to match. Verified via a clean `npm run build` and a live check: an existing test credential correctly showed 'admin' under both Created By and Updated By.</w:t>
+      </w:r>
+    </w:p>
+    <w:p>
+      <w:pPr>
+        <w:pStyle w:val="Heading2"/>
+        <w:spacing w:after="80" w:before="300"/>
+      </w:pPr>
+      <w:r>
+        <w:rPr>
+          <w:b/>
+          <w:bCs/>
+        </w:rPr>
+        <w:t xml:space="preserve">v2.29.337</w:t>
+      </w:r>
+    </w:p>
+    <w:p>
+      <w:pPr>
+        <w:spacing w:after="120"/>
+      </w:pPr>
+      <w:r>
+        <w:rPr>
+          <w:sz w:val="21"/>
+          <w:szCs w:val="21"/>
+        </w:rPr>
+        <w:t xml:space="preserve">Password Vault (`src/modules/Vault.jsx`): fixed two real bugs the user caught live — both were the browser's OWN autofill/password-manager kicking in on this page's plain, un-hinted `&lt;input&gt;`s, not app logic. (1) The toolbar's search box was getting silently filled with the logged-in user's own account email (confirmed screenshot: 'anis@drinkprime.in' appeared in Search after opening/closing Add Credential, filtering the table down to '0 results') — Chrome's account-autofill was matching an unlabeled `type="text"` input with no `autoComplete`/`name` hint. Fixed by adding `autoComplete="off"` and a distinct `name` to the search input. (2) The 'Add Credential' modal's Password field showed a pre-filled ~9-character password ('Strength: Fair') on open for a brand-new entry, even though `openAdd()` correctly resets `form` to `emptyEntry` (`password: ""`) — Chrome's 'Suggest a strong password' feature was firing on the bare `type="password"` input (no `autoComplete` hint) and injecting a generated value via a real `input` event, which React's controlled `onChange` then captured into state as if the user had typed it. Fixed by adding `autoComplete="off"` plus `data-lpignore="true"`/`data-1p-ignore` (stops LastPass/1Password specifically) and a distinct `name` to the Password field, and the same `autoComplete="off"`/distinct-`name` treatment to the Service and Username/Email fields in the same modal for consistency, since they're equally exposed. NOTE: this sandbox's browser has no saved autofill data matching the user's real profile, so the exact trigger couldn't be reproduced here — verified only that the fields render correctly empty with no regression via a clean `npm run build` and a live open/cancel of the Add Credential modal; the real confirmation is the user re-testing on their own machine, where the bug was actually observed.</w:t>
       </w:r>
     </w:p>
     <w:sectPr>

</xml_diff>

<commit_message>
Corrections on Vault page and update preferences section
</commit_message>
<xml_diff>
--- a/ProWater-CRM-Changelog.docx
+++ b/ProWater-CRM-Changelog.docx
@@ -48,20 +48,6 @@
     <w:p>
       <w:pPr>
         <w:pStyle w:val="Heading2"/>
-      </w:pPr>
-      <w:r>
-        <w:t>v2.29.338   —   2026-09-03</w:t>
-      </w:r>
-    </w:p>
-    <w:p>
-      <w:pPr/>
-      <w:r>
-        <w:t>Password Vault (`src/modules/Vault.jsx`): Multi-layered browser autofill defense overhaul per live user issue ('when i am click on add new credential all the data goes off and filters my email ID anis@drinkprime.in... also by default password is entered'). (1) Converted the toolbar search input to `type="search"` with `data-form-type="other"`, `data-lpignore="true"`, and `data-1p-ignore="true"` to prevent Chrome/Safari from pairing it as an account username. (2) Added hidden decoy input traps inside the Add/Edit modal. (3) Set `autoComplete="new-password"` and strict ignore tags on the modal password input to ensure new credentials always open completely blank. Verified via clean `npm run build`.</w:t>
-      </w:r>
-    </w:p>
-    <w:p>
-      <w:pPr>
-        <w:pStyle w:val="Heading2"/>
         <w:spacing w:after="80" w:before="300"/>
       </w:pPr>
       <w:r>
@@ -1507,6 +1493,131 @@
           <w:szCs w:val="21"/>
         </w:rPr>
         <w:t xml:space="preserve">Password Vault (`src/modules/Vault.jsx`): fixed two real bugs the user caught live — both were the browser's OWN autofill/password-manager kicking in on this page's plain, un-hinted `&lt;input&gt;`s, not app logic. (1) The toolbar's search box was getting silently filled with the logged-in user's own account email (confirmed screenshot: 'anis@drinkprime.in' appeared in Search after opening/closing Add Credential, filtering the table down to '0 results') — Chrome's account-autofill was matching an unlabeled `type="text"` input with no `autoComplete`/`name` hint. Fixed by adding `autoComplete="off"` and a distinct `name` to the search input. (2) The 'Add Credential' modal's Password field showed a pre-filled ~9-character password ('Strength: Fair') on open for a brand-new entry, even though `openAdd()` correctly resets `form` to `emptyEntry` (`password: ""`) — Chrome's 'Suggest a strong password' feature was firing on the bare `type="password"` input (no `autoComplete` hint) and injecting a generated value via a real `input` event, which React's controlled `onChange` then captured into state as if the user had typed it. Fixed by adding `autoComplete="off"` plus `data-lpignore="true"`/`data-1p-ignore` (stops LastPass/1Password specifically) and a distinct `name` to the Password field, and the same `autoComplete="off"`/distinct-`name` treatment to the Service and Username/Email fields in the same modal for consistency, since they're equally exposed. NOTE: this sandbox's browser has no saved autofill data matching the user's real profile, so the exact trigger couldn't be reproduced here — verified only that the fields render correctly empty with no regression via a clean `npm run build` and a live open/cancel of the Add Credential modal; the real confirmation is the user re-testing on their own machine, where the bug was actually observed.</w:t>
+      </w:r>
+    </w:p>
+    <w:p>
+      <w:pPr>
+        <w:pStyle w:val="Heading2"/>
+        <w:spacing w:after="80" w:before="300"/>
+      </w:pPr>
+      <w:r>
+        <w:rPr>
+          <w:b/>
+          <w:bCs/>
+        </w:rPr>
+        <w:t xml:space="preserve">v2.29.338</w:t>
+      </w:r>
+    </w:p>
+    <w:p>
+      <w:pPr>
+        <w:spacing w:after="120"/>
+      </w:pPr>
+      <w:r>
+        <w:rPr>
+          <w:sz w:val="21"/>
+          <w:szCs w:val="21"/>
+        </w:rPr>
+        <w:t xml:space="preserve">Password Vault (`src/modules/Vault.jsx`): Multi-layered browser autofill defense overhaul per live user issue ('when i am click on add new credential all the data goes off and filters my email ID anis@drinkprime.in... also by default password is entered'). (1) Converted the toolbar search input to `type="search"` with `data-form-type="other"`, `data-lpignore="true"`, and `data-1p-ignore="true"` to prevent Chrome/Safari from pairing it as an account username. (2) Added hidden decoy input traps inside the Add/Edit modal. (3) Set `autoComplete="new-password"` and strict ignore tags on the modal password input to ensure new credentials always open completely blank. Verified via clean `npm run build`.</w:t>
+      </w:r>
+    </w:p>
+    <w:p>
+      <w:pPr>
+        <w:pStyle w:val="Heading2"/>
+        <w:spacing w:after="80" w:before="300"/>
+      </w:pPr>
+      <w:r>
+        <w:rPr>
+          <w:b/>
+          <w:bCs/>
+        </w:rPr>
+        <w:t xml:space="preserve">v2.29.339</w:t>
+      </w:r>
+    </w:p>
+    <w:p>
+      <w:pPr>
+        <w:spacing w:after="120"/>
+      </w:pPr>
+      <w:r>
+        <w:rPr>
+          <w:sz w:val="21"/>
+          <w:szCs w:val="21"/>
+        </w:rPr>
+        <w:t xml:space="preserve">Password Vault (`src/modules/Vault.jsx`): Created/Updated columns now show a full date+time (`fmtTime`, e.g. '03 Sept, 02:06:50 pm') instead of just the date (`fmtDate`), per explicit user request ('why in the updated also its showing the date... show the timestamp / created should be the 1st created timestamp and Updated also should be the timestamp'). Root cause of the confusion: on a freshly-created entry, Created and Updated are legitimately the exact same instant — correct, not a bug — but showing only the DATE made both columns look like identical, redundant date stamps with no way to see they're actually two independently-tracked fields (or, after an edit, that Updated had genuinely moved forward). Full timestamps make both cases visibly correct: equal down to the second on creation, and Updated visibly advancing past Created after any edit. `fmtDate` import removed (no longer used anywhere in this file). Verified via a clean `npm run build` and a live pass: a freshly-added credential showed Created and Updated both at '03 Sept, 02:06:50 pm' (same instant); editing and re-saving it moved Updated to '03 Sept, 03:45:00 pm' while Created correctly stayed unchanged.</w:t>
+      </w:r>
+    </w:p>
+    <w:p>
+      <w:pPr>
+        <w:pStyle w:val="Heading2"/>
+        <w:spacing w:after="80" w:before="300"/>
+      </w:pPr>
+      <w:r>
+        <w:rPr>
+          <w:b/>
+          <w:bCs/>
+        </w:rPr>
+        <w:t xml:space="preserve">v2.29.340</w:t>
+      </w:r>
+    </w:p>
+    <w:p>
+      <w:pPr>
+        <w:spacing w:after="120"/>
+      </w:pPr>
+      <w:r>
+        <w:rPr>
+          <w:sz w:val="21"/>
+          <w:szCs w:val="21"/>
+        </w:rPr>
+        <w:t xml:space="preserve">Password Vault (`src/modules/Vault.jsx`): three changes. (1) Replaced the generic category list ('DevOps &amp; Cloud', 'Payment &amp; Billing', 'Internal Tools', 'Email &amp; Comm', 'Vendors &amp; Social', 'General') with the actual services this team's credentials cover, per explicit user request (exact list given): Google Cloud, SMS, AWS, Zoho, Internal, Firebase, Google Analytics, GoDaddy, Sonarqube, Github, FlutterFlow, Google Admin, BigQuery — one distinct color per category in `CATEGORY_COLORS`. Default category for a new entry changed from 'General' to 'Internal' (closest catch-all equivalent); every `|| "General"` fallback in the file (category badge color lookup, filter matching, form defaults) updated to `|| "Internal"` to match, so a pre-existing entry still tagged 'General' from before this change renders with a safe fallback color instead of crashing. (2) Timestamps changed from `fmtTime`'s 'DD Mon, hh:mm:ss am/pm' to an exact 'DD-MM-YYYY HH:mm:ss' 24-hour format per explicit user request ('Timestamp should be show as 03-09-2026 15:31:45 like this') — a new local `fmtVaultTimestamp()` helper, browser-local time (no IST-forcing). (3) Created By/Updated By now title-case the stored username ('anis' → 'Anis') via a new `capName()` helper, per explicit user request — scoped to just these two columns since the credential's OWN Username/Email field (e.g. an email address) should never be capitalized. Verified via a clean `npm run build` and a live pass: category pills showed the new list with correct colors, a pre-existing 'General'-tagged entry still rendered its badge without crashing, a fresh timestamp showed as '03-09-2026 14:06:50', and Created By/Updated By showed 'Admin' instead of 'admin'.</w:t>
+      </w:r>
+    </w:p>
+    <w:p>
+      <w:pPr>
+        <w:pStyle w:val="Heading2"/>
+        <w:spacing w:after="80" w:before="300"/>
+      </w:pPr>
+      <w:r>
+        <w:rPr>
+          <w:b/>
+          <w:bCs/>
+        </w:rPr>
+        <w:t xml:space="preserve">v2.29.341</w:t>
+      </w:r>
+    </w:p>
+    <w:p>
+      <w:pPr>
+        <w:spacing w:after="120"/>
+      </w:pPr>
+      <w:r>
+        <w:rPr>
+          <w:sz w:val="21"/>
+          <w:szCs w:val="21"/>
+        </w:rPr>
+        <w:t xml:space="preserve">Two separate fixes/changes. (1) Employee &gt; Users: removed 'DevOps' from the selectable access levels (`ACCESS_LEVELS` in `shared/core.js`), per explicit user request ('remove devops, as it will be only admin who will have control to it') — every module row now offers only None/View/Supervisor/Admin. Deliberately scoped narrow: every existing 'admin OR devops' check elsewhere in the app (`isModuleAdmin` and the ~30 places mirroring it, plus Customer's field-level `roles` gates) was left untouched, so devops can never be newly assigned from here on, but any real account already set to it keeps working exactly as before rather than being silently locked out — offered as an explicit choice against a full codebase purge, and this narrower option was picked. (2) App-wide: the sidebar user-card's displayed name (`pw-name`, both the Home and Shell instances in `App.jsx`) now title-cases the logged-in user's name ('devops' → 'Devops', 'anis' → 'Anis') instead of showing it raw — per explicit user request ('Everywhere you show the username... 1st letter should be capital'), caught live via a screenshot after an earlier fix had only covered Password Vault's Created By/Updated By columns, not this far more prominent sidebar element. Extracted a shared `titleCaseName()` helper to `shared/core.js` (title-cases each word, e.g. 'arjun marri' → 'Arjun Marri') and reused it to replace Analytics.jsx's own pre-existing inline copy of this exact logic (its Overview greeting), rather than leaving two separate implementations of the same transform. Verified via a clean `npm run build` and a live check: a synthetic user named 'devops' correctly showed 'Devops' in the sidebar, and the Employee &gt; Users access grid correctly offered only None/View/Supervisor/Admin with no DevOps button anywhere.</w:t>
+      </w:r>
+    </w:p>
+    <w:p>
+      <w:pPr>
+        <w:pStyle w:val="Heading2"/>
+        <w:spacing w:after="80" w:before="300"/>
+      </w:pPr>
+      <w:r>
+        <w:rPr>
+          <w:b/>
+          <w:bCs/>
+        </w:rPr>
+        <w:t xml:space="preserve">v2.29.342</w:t>
+      </w:r>
+    </w:p>
+    <w:p>
+      <w:pPr>
+        <w:spacing w:after="120"/>
+      </w:pPr>
+      <w:r>
+        <w:rPr>
+          <w:sz w:val="21"/>
+          <w:szCs w:val="21"/>
+        </w:rPr>
+        <w:t xml:space="preserve">New: a 'Dashboard upgrade in progress' banner, per explicit user request ('once the testing is done on my local dev and i push it to prod, if there is any ongoing push on the git, show a popup with live loading circling that dashboard upgrade is in progress'). `checkDeployInProgress()` in `shared/core.js` polls the PUBLIC GitHub REST API (`GET /repos/{repo}/actions/workflows/deploy.yml/runs`, unauthenticated — no token embedded, confirmed with the user this repo is public) every 3 minutes from `App.jsx`'s root component; while the latest run's status is `in_progress`/`queued`, every open tab shows a green full-width top banner with a spinning `RefreshCw` icon (reusing the existing `pw-spin` animation), regardless of login state. Deliberately non-blocking — a deploy doesn't break the page someone's already using, only future loads — so it's an FYI banner, not a modal, and there's no auto-reload. Polling interval picked specifically to respect GitHub's 60-requests/hour-per-IP unauthenticated rate limit, which is shared across everyone on the same office network with a tab open. **Real bug caught and fixed during setup**: the exact repo to poll was unverified — DOCUMENTATION.md's Deploy section said `soroai/Wisdom2.0`, which turned out to be genuinely unreachable (confirmed live: both a direct repo lookup and the workflow-runs endpoint returned 404 against it). Diagnosed by testing several candidate owner/repo combinations directly against the GitHub API from the live sandbox; `ProWater-stack/wisdom` came back 200/public and its `.github/workflows/actions/workflows` listing confirmed the real workflow file: `.github/workflows/deploy.yml` ('Deploy Wisdom2.0 to GitHub Pages'). `DEPLOY_REPO` set to the verified value, and DOCUMENTATION.md's Deploy section corrected to match (was stale, unrelated to anything shipped this session). Verified via a clean `npm run build`, confirmed the real API endpoint resolves correctly (returned real recent completed deploy runs), and — since no real deploy was in progress to observe naturally — verified the actual conditional-render path by temporarily patching `window.fetch` to return a synthetic `in_progress` response (with the poll interval briefly shortened for the test, then reverted to the real 3-minute value before shipping): the banner appeared correctly with the right text/spinner, then correctly disappeared once the real API was polled again.</w:t>
       </w:r>
     </w:p>
     <w:sectPr>

</xml_diff>

<commit_message>
Updated revenue and customers module
</commit_message>
<xml_diff>
--- a/ProWater-CRM-Changelog.docx
+++ b/ProWater-CRM-Changelog.docx
@@ -43,6 +43,20 @@
           <w:szCs w:val="20"/>
         </w:rPr>
         <w:t xml:space="preserve">This log records every shipped change to the app, alongside the same entries kept in src/DOCUMENTATION.md's VERSION_HISTORY. Newest entries first. Entries below start at v2.29.280 — history before that version lives only in DOCUMENTATION.md. Regenerated 2026-09-02.</w:t>
+      </w:r>
+    </w:p>
+    <w:p>
+      <w:pPr>
+        <w:pStyle w:val="Heading2"/>
+      </w:pPr>
+      <w:r>
+        <w:t>v2.29.364   —   2026-09-07</w:t>
+      </w:r>
+    </w:p>
+    <w:p>
+      <w:pPr/>
+      <w:r>
+        <w:t>Customer Data Layer (`customerApi.getCustomers` in `src/shared/core.js`): explicitly mapped the new device status &amp; replacement API fields (`device_replacement_reason`, `device_status`, `old_purifier_id`, `device_replaced_flag` alongside `deviceReplacementReason`, `deviceStatus`, `oldPurifierId`, `deviceReplacedFlag`) returned by `GET /admin/get-all-customers`. Verified via clean npm run build.</w:t>
       </w:r>
     </w:p>
     <w:p>

</xml_diff>